<commit_message>
feat(responsive): add adaptive multiplatform desktop shell and 2-column clinical workspace
</commit_message>
<xml_diff>
--- a/INFORME_LAB05_PLATAFORMAS_EMERGENTES_ACOMPANAMED.docx
+++ b/INFORME_LAB05_PLATAFORMAS_EMERGENTES_ACOMPANAMED.docx
@@ -656,6 +656,90 @@
       </w:r>
     </w:p>
     <w:p>
+      <w:pPr>
+        <w:spacing w:before="240" w:after="80"/>
+      </w:pPr>
+      <w:r>
+        <w:rPr>
+          <w:b/>
+          <w:color w:val="0284C7"/>
+          <w:sz w:val="26"/>
+        </w:rPr>
+        <w:t>C. Multiplataforma en React Native: Del Antipatrón 'Móvil Inflado' a la Arquitectura Adaptativa</w:t>
+      </w:r>
+    </w:p>
+    <w:p>
+      <w:r>
+        <w:t xml:space="preserve">Un dilema común en el desarrollo con React Native for Web es el denominado </w:t>
+      </w:r>
+      <w:r>
+        <w:rPr>
+          <w:i/>
+        </w:rPr>
+        <w:t>antipatrón del móvil inflado (Blown-up Mobile Anti-pattern)</w:t>
+      </w:r>
+      <w:r>
+        <w:t>. React Native nació originalmente para sistemas operativos móviles (Android e iOS). Al exportar a la Web, el motor Flexbox de React Native interpreta un ancho de '100%' contra el viewport completo del monitor del computador (1920px o más), provocando que botones clínicos y tarjetas se estiren horizontalmente de forma desproporcionada e inaccesible.</w:t>
+        <w:br/>
+        <w:br/>
+      </w:r>
+      <w:r>
+        <w:t xml:space="preserve">Para resolver esto y elevar la aplicación al estándar de la industria (similar a Twitter/X Web, Slack o WhatsApp Web), se implementó un sistema de diseño adaptativo con </w:t>
+      </w:r>
+      <w:r>
+        <w:rPr>
+          <w:b/>
+        </w:rPr>
+        <w:t>useWindowDimensions()</w:t>
+      </w:r>
+      <w:r>
+        <w:t xml:space="preserve"> que ofrece dos experiencias según el dispositivo:</w:t>
+        <w:br/>
+      </w:r>
+    </w:p>
+    <w:p>
+      <w:pPr>
+        <w:pStyle w:val="ListBullet"/>
+      </w:pPr>
+      <w:r>
+        <w:rPr>
+          <w:b/>
+        </w:rPr>
+        <w:t xml:space="preserve">Móvil Nativo (&lt;768px): </w:t>
+      </w:r>
+      <w:r>
+        <w:t>Disposición pura a 1 columna vertical con barra inferior de navegación (Bottom Navigation) accesible al alcance del pulgar.</w:t>
+      </w:r>
+    </w:p>
+    <w:p>
+      <w:pPr>
+        <w:pStyle w:val="ListBullet"/>
+      </w:pPr>
+      <w:r>
+        <w:rPr>
+          <w:b/>
+        </w:rPr>
+        <w:t xml:space="preserve">Modo 1 Desktop — Shell Ergonómico Centrado: </w:t>
+      </w:r>
+      <w:r>
+        <w:t>En monitores de escritorio, la aplicación confina su chasis a 480px centrados en un canvas neutro (#EEF2F6) con sutil elevación y bordes de delimitación. Esto evita que los botones clínicos se estiren y preserva la ergonomía humana.</w:t>
+      </w:r>
+    </w:p>
+    <w:p>
+      <w:pPr>
+        <w:pStyle w:val="ListBullet"/>
+      </w:pPr>
+      <w:r>
+        <w:rPr>
+          <w:b/>
+        </w:rPr>
+        <w:t xml:space="preserve">Modo 2 Desktop — Estación de Trabajo Clínica (Split View de 2 Columnas): </w:t>
+      </w:r>
+      <w:r>
+        <w:t>Aprovecha la pantalla ancha (&gt;=1024px) dividiendo el espacio en dos columnas paralelas: a la izquierda el Plan Cronológico del Paciente y a la derecha el Panel del Cuidador, Botiquín y Emergencia en tiempo real. Esto permite a médicos y familiares supervisar y registrar sin alternar pestañas.</w:t>
+      </w:r>
+    </w:p>
+    <w:p>
       <w:r>
         <w:br w:type="page"/>
       </w:r>
@@ -724,7 +808,7 @@
           <w:color w:val="475569"/>
           <w:sz w:val="19"/>
         </w:rPr>
-        <w:t>Figura 1: Pantalla Principal 'Hoy' — Hilo Cronológico con Botonera Vertical Apilada e Identificación Anatómica de Pastillas</w:t>
+        <w:t>Figura 1: Pantalla Principal 'Hoy' (Móvil) — Hilo Cronológico con Botonera Vertical Apilada</w:t>
       </w:r>
     </w:p>
     <w:p>
@@ -778,7 +862,115 @@
           <w:color w:val="475569"/>
           <w:sz w:val="19"/>
         </w:rPr>
-        <w:t>Figura 2: Pestaña 'Cuidador' — Telemetría de Adherencia (100%), Período de Gracia de 30 min y Desglose por Fármaco</w:t>
+        <w:t>Figura 2: Pestaña 'Cuidador' (Móvil) — Telemetría de Adherencia (100%) y Período de Gracia</w:t>
+      </w:r>
+    </w:p>
+    <w:p>
+      <w:pPr>
+        <w:spacing w:before="160" w:after="80"/>
+        <w:jc w:val="center"/>
+      </w:pPr>
+      <w:r>
+        <w:drawing>
+          <wp:inline xmlns:a="http://schemas.openxmlformats.org/drawingml/2006/main" xmlns:pic="http://schemas.openxmlformats.org/drawingml/2006/picture">
+            <wp:extent cx="2926080" cy="1874520"/>
+            <wp:docPr id="3" name="Picture 3"/>
+            <wp:cNvGraphicFramePr>
+              <a:graphicFrameLocks noChangeAspect="1"/>
+            </wp:cNvGraphicFramePr>
+            <a:graphic>
+              <a:graphicData uri="http://schemas.openxmlformats.org/drawingml/2006/picture">
+                <pic:pic>
+                  <pic:nvPicPr>
+                    <pic:cNvPr id="0" name="desktop_mode_mobile_shell.png"/>
+                    <pic:cNvPicPr/>
+                  </pic:nvPicPr>
+                  <pic:blipFill>
+                    <a:blip r:embed="rId11"/>
+                    <a:stretch>
+                      <a:fillRect/>
+                    </a:stretch>
+                  </pic:blipFill>
+                  <pic:spPr>
+                    <a:xfrm>
+                      <a:off x="0" y="0"/>
+                      <a:ext cx="2926080" cy="1874520"/>
+                    </a:xfrm>
+                    <a:prstGeom prst="rect"/>
+                  </pic:spPr>
+                </pic:pic>
+              </a:graphicData>
+            </a:graphic>
+          </wp:inline>
+        </w:drawing>
+      </w:r>
+    </w:p>
+    <w:p>
+      <w:pPr>
+        <w:spacing w:after="280"/>
+        <w:jc w:val="center"/>
+      </w:pPr>
+      <w:r>
+        <w:rPr>
+          <w:i/>
+          <w:color w:val="475569"/>
+          <w:sz w:val="19"/>
+        </w:rPr>
+        <w:t>Figura 3: Ejecución en Navegador Web Desktop — Modo Móvil Ergonómico Centrado (Cero Elementos Estirados)</w:t>
+      </w:r>
+    </w:p>
+    <w:p>
+      <w:pPr>
+        <w:spacing w:before="160" w:after="80"/>
+        <w:jc w:val="center"/>
+      </w:pPr>
+      <w:r>
+        <w:drawing>
+          <wp:inline xmlns:a="http://schemas.openxmlformats.org/drawingml/2006/main" xmlns:pic="http://schemas.openxmlformats.org/drawingml/2006/picture">
+            <wp:extent cx="2926080" cy="1874520"/>
+            <wp:docPr id="4" name="Picture 4"/>
+            <wp:cNvGraphicFramePr>
+              <a:graphicFrameLocks noChangeAspect="1"/>
+            </wp:cNvGraphicFramePr>
+            <a:graphic>
+              <a:graphicData uri="http://schemas.openxmlformats.org/drawingml/2006/picture">
+                <pic:pic>
+                  <pic:nvPicPr>
+                    <pic:cNvPr id="0" name="desktop_mode_split_view.png"/>
+                    <pic:cNvPicPr/>
+                  </pic:nvPicPr>
+                  <pic:blipFill>
+                    <a:blip r:embed="rId12"/>
+                    <a:stretch>
+                      <a:fillRect/>
+                    </a:stretch>
+                  </pic:blipFill>
+                  <pic:spPr>
+                    <a:xfrm>
+                      <a:off x="0" y="0"/>
+                      <a:ext cx="2926080" cy="1874520"/>
+                    </a:xfrm>
+                    <a:prstGeom prst="rect"/>
+                  </pic:spPr>
+                </pic:pic>
+              </a:graphicData>
+            </a:graphic>
+          </wp:inline>
+        </w:drawing>
+      </w:r>
+    </w:p>
+    <w:p>
+      <w:pPr>
+        <w:spacing w:after="280"/>
+        <w:jc w:val="center"/>
+      </w:pPr>
+      <w:r>
+        <w:rPr>
+          <w:i/>
+          <w:color w:val="475569"/>
+          <w:sz w:val="19"/>
+        </w:rPr>
+        <w:t>Figura 4: Ejecución en Navegador Web Desktop — Modo Panel Clínico PC (Split View de 2 Columnas Paralelas)</w:t>
       </w:r>
     </w:p>
     <w:p>
@@ -790,7 +982,7 @@
         <w:drawing>
           <wp:inline xmlns:a="http://schemas.openxmlformats.org/drawingml/2006/main" xmlns:pic="http://schemas.openxmlformats.org/drawingml/2006/picture">
             <wp:extent cx="2926080" cy="6335105"/>
-            <wp:docPr id="3" name="Picture 3"/>
+            <wp:docPr id="5" name="Picture 5"/>
             <wp:cNvGraphicFramePr>
               <a:graphicFrameLocks noChangeAspect="1"/>
             </wp:cNvGraphicFramePr>
@@ -802,7 +994,7 @@
                     <pic:cNvPicPr/>
                   </pic:nvPicPr>
                   <pic:blipFill>
-                    <a:blip r:embed="rId11"/>
+                    <a:blip r:embed="rId13"/>
                     <a:stretch>
                       <a:fillRect/>
                     </a:stretch>
@@ -832,7 +1024,7 @@
           <w:color w:val="475569"/>
           <w:sz w:val="19"/>
         </w:rPr>
-        <w:t>Figura 3: Pestaña 'Botiquín' — Control de Inventario, Días Restantes de Autonomía y Reposición +30</w:t>
+        <w:t>Figura 5: Pestaña 'Botiquín' — Control de Inventario y Reposición +30</w:t>
       </w:r>
     </w:p>
     <w:p>
@@ -844,7 +1036,7 @@
         <w:drawing>
           <wp:inline xmlns:a="http://schemas.openxmlformats.org/drawingml/2006/main" xmlns:pic="http://schemas.openxmlformats.org/drawingml/2006/picture">
             <wp:extent cx="2926080" cy="6335105"/>
-            <wp:docPr id="4" name="Picture 4"/>
+            <wp:docPr id="6" name="Picture 6"/>
             <wp:cNvGraphicFramePr>
               <a:graphicFrameLocks noChangeAspect="1"/>
             </wp:cNvGraphicFramePr>
@@ -856,7 +1048,7 @@
                     <pic:cNvPicPr/>
                   </pic:nvPicPr>
                   <pic:blipFill>
-                    <a:blip r:embed="rId12"/>
+                    <a:blip r:embed="rId14"/>
                     <a:stretch>
                       <a:fillRect/>
                     </a:stretch>
@@ -886,7 +1078,7 @@
           <w:color w:val="475569"/>
           <w:sz w:val="19"/>
         </w:rPr>
-        <w:t>Figura 4: Pestaña 'Emergencia' — Ficha Médica Hospitalaria ICE con Tipo de Sangre O+, Alergias y Discado SAMU</w:t>
+        <w:t>Figura 6: Pestaña 'Emergencia' — Ficha Médica Hospitalaria ICE con Discado SAMU 106</w:t>
       </w:r>
     </w:p>
     <w:p>

</xml_diff>

<commit_message>
feat(deploy): configure Firebase Hosting with live production URL and update report annexes
</commit_message>
<xml_diff>
--- a/INFORME_LAB05_PLATAFORMAS_EMERGENTES_ACOMPANAMED.docx
+++ b/INFORME_LAB05_PLATAFORMAS_EMERGENTES_ACOMPANAMED.docx
@@ -6271,7 +6271,35 @@
         <w:t xml:space="preserve">Repositorio GitHub Oficial: </w:t>
       </w:r>
       <w:r>
-        <w:t>https://github.com/usuario/acompanamed-plataformas-emergentes (Código fuente completo, ramas de trabajo y commits estructurados bajo Conventional Commits).</w:t>
+        <w:t>https://github.com/csalhuaa/AcompanaMed-ReactNative (Código fuente completo, ramas de trabajo, releases y commits bajo estándar Conventional Commits).</w:t>
+      </w:r>
+    </w:p>
+    <w:p>
+      <w:pPr>
+        <w:pStyle w:val="ListBullet"/>
+      </w:pPr>
+      <w:r>
+        <w:rPr>
+          <w:b/>
+        </w:rPr>
+        <w:t xml:space="preserve">Despliegue Web en Vivo (Producción Firebase Hosting): </w:t>
+      </w:r>
+      <w:r>
+        <w:t>https://acompanamed-unsa-2026.web.app (Despliegue accesible en la nube de Google con soporte multiplataforma responsivo y SSL).</w:t>
+      </w:r>
+    </w:p>
+    <w:p>
+      <w:pPr>
+        <w:pStyle w:val="ListBullet"/>
+      </w:pPr>
+      <w:r>
+        <w:rPr>
+          <w:b/>
+        </w:rPr>
+        <w:t xml:space="preserve">Proyecto Firebase BaaS Configurado: </w:t>
+      </w:r>
+      <w:r>
+        <w:t>acompanamed-unsa-2026 (Consola: https://console.firebase.google.com/project/acompanamed-unsa-2026/overview).</w:t>
       </w:r>
     </w:p>
     <w:p>
@@ -6328,6 +6356,20 @@
       </w:r>
       <w:r>
         <w:t>npx expo export -p web (Genera el bundle estático para producción en la carpeta dist/).</w:t>
+      </w:r>
+    </w:p>
+    <w:p>
+      <w:pPr>
+        <w:pStyle w:val="ListBullet"/>
+      </w:pPr>
+      <w:r>
+        <w:rPr>
+          <w:b/>
+        </w:rPr>
+        <w:t xml:space="preserve">Despliegue a Firebase Hosting: </w:t>
+      </w:r>
+      <w:r>
+        <w:t>firebase deploy --only hosting (Despliega la aplicación estática a los servidores globales CDN de Google).</w:t>
       </w:r>
     </w:p>
     <w:p>

</xml_diff>